<commit_message>
Pagos ME: pasos de conexion para Fundadores en 5 (programa, codigo, Asistente en el perfil de la cuenta, conectarlo con el codigo, traer) que se marcan solos y siguen a la vista hasta que un perfil de Chrome se conecta; aviso 'PC prendida pero ningun perfil con el Asistente' en vez de 'apagada'. Guia PDF al dia
Co-Authored-By: Claude Opus 5.5 <noreply@anthropic.com>
</commit_message>
<xml_diff>
--- a/tools/vigilante-pagos-me/guia/Guia-Dueno-Activar-Pagos-ME.docx
+++ b/tools/vigilante-pagos-me/guia/Guia-Dueno-Activar-Pagos-ME.docx
@@ -2062,6 +2062,139 @@
     <w:basedOn w:val="Normal"/>
     <w:qFormat/>
   </w:style>
+  <w:style w:type="paragraph" w:styleId="Caption">
+    <w:name w:val="caption"/>
+    <w:basedOn w:val="Normal"/>
+    <w:next w:val="Normal"/>
+    <w:uiPriority w:val="35"/>
+    <w:semiHidden/>
+    <w:unhideWhenUsed/>
+    <w:qFormat/>
+    <w:pPr>
+      <w:spacing w:after="200"/>
+    </w:pPr>
+    <w:rPr>
+      <w:i/>
+      <w:iCs/>
+      <w:color w:val="44546A" w:themeColor="dark2"/>
+      <w:sz w:val="18"/>
+      <w:szCs w:val="18"/>
+    </w:rPr>
+  </w:style>
+  <w:style w:type="paragraph" w:styleId="Bibliography">
+    <w:name w:val="Bibliography"/>
+    <w:basedOn w:val="Normal"/>
+    <w:next w:val="Normal"/>
+    <w:uiPriority w:val="37"/>
+    <w:unhideWhenUsed/>
+  </w:style>
+  <w:style w:type="paragraph" w:styleId="TOC1">
+    <w:name w:val="toc 1"/>
+    <w:basedOn w:val="Normal"/>
+    <w:next w:val="Normal"/>
+    <w:uiPriority w:val="39"/>
+    <w:semiHidden/>
+    <w:unhideWhenUsed/>
+    <w:pPr>
+      <w:spacing w:after="100"/>
+    </w:pPr>
+  </w:style>
+  <w:style w:type="paragraph" w:styleId="TOC2">
+    <w:name w:val="toc 2"/>
+    <w:basedOn w:val="Normal"/>
+    <w:next w:val="Normal"/>
+    <w:uiPriority w:val="39"/>
+    <w:semiHidden/>
+    <w:unhideWhenUsed/>
+    <w:pPr>
+      <w:spacing w:after="100"/>
+      <w:ind w:left="220"/>
+    </w:pPr>
+  </w:style>
+  <w:style w:type="paragraph" w:styleId="TOC3">
+    <w:name w:val="toc 3"/>
+    <w:basedOn w:val="Normal"/>
+    <w:next w:val="Normal"/>
+    <w:uiPriority w:val="39"/>
+    <w:semiHidden/>
+    <w:unhideWhenUsed/>
+    <w:pPr>
+      <w:spacing w:after="100"/>
+      <w:ind w:left="440"/>
+    </w:pPr>
+  </w:style>
+  <w:style w:type="paragraph" w:styleId="TOC4">
+    <w:name w:val="toc 4"/>
+    <w:basedOn w:val="Normal"/>
+    <w:next w:val="Normal"/>
+    <w:uiPriority w:val="39"/>
+    <w:semiHidden/>
+    <w:unhideWhenUsed/>
+    <w:pPr>
+      <w:spacing w:after="100"/>
+      <w:ind w:left="660"/>
+    </w:pPr>
+  </w:style>
+  <w:style w:type="paragraph" w:styleId="TOC5">
+    <w:name w:val="toc 5"/>
+    <w:basedOn w:val="Normal"/>
+    <w:next w:val="Normal"/>
+    <w:uiPriority w:val="39"/>
+    <w:semiHidden/>
+    <w:unhideWhenUsed/>
+    <w:pPr>
+      <w:spacing w:after="100"/>
+      <w:ind w:left="880"/>
+    </w:pPr>
+  </w:style>
+  <w:style w:type="paragraph" w:styleId="TOC6">
+    <w:name w:val="toc 6"/>
+    <w:basedOn w:val="Normal"/>
+    <w:next w:val="Normal"/>
+    <w:uiPriority w:val="39"/>
+    <w:semiHidden/>
+    <w:unhideWhenUsed/>
+    <w:pPr>
+      <w:spacing w:after="100"/>
+      <w:ind w:left="1100"/>
+    </w:pPr>
+  </w:style>
+  <w:style w:type="paragraph" w:styleId="TOC7">
+    <w:name w:val="toc 7"/>
+    <w:basedOn w:val="Normal"/>
+    <w:next w:val="Normal"/>
+    <w:uiPriority w:val="39"/>
+    <w:semiHidden/>
+    <w:unhideWhenUsed/>
+    <w:pPr>
+      <w:spacing w:after="100"/>
+      <w:ind w:left="1320"/>
+    </w:pPr>
+  </w:style>
+  <w:style w:type="paragraph" w:styleId="TOC8">
+    <w:name w:val="toc 8"/>
+    <w:basedOn w:val="Normal"/>
+    <w:next w:val="Normal"/>
+    <w:uiPriority w:val="39"/>
+    <w:semiHidden/>
+    <w:unhideWhenUsed/>
+    <w:pPr>
+      <w:spacing w:after="100"/>
+      <w:ind w:left="1540"/>
+    </w:pPr>
+  </w:style>
+  <w:style w:type="paragraph" w:styleId="TOC9">
+    <w:name w:val="toc 9"/>
+    <w:basedOn w:val="Normal"/>
+    <w:next w:val="Normal"/>
+    <w:uiPriority w:val="39"/>
+    <w:semiHidden/>
+    <w:unhideWhenUsed/>
+    <w:pPr>
+      <w:spacing w:after="100"/>
+      <w:ind w:left="1760"/>
+    </w:pPr>
+  </w:style>
   <w:style w:type="character" w:styleId="Hyperlink">
     <w:name w:val="Hyperlink"/>
     <w:basedOn w:val="DefaultParagraphFont"/>
@@ -2145,6 +2278,13 @@
       <w:sz w:val="20"/>
       <w:szCs w:val="20"/>
     </w:rPr>
+  </w:style>
+  <w:style w:type="character" w:styleId="LineNumber">
+    <w:name w:val="line number"/>
+    <w:basedOn w:val="DefaultParagraphFont"/>
+    <w:uiPriority w:val="99"/>
+    <w:semiHidden/>
+    <w:unhideWhenUsed/>
   </w:style>
   <w:style w:type="paragraph" w:styleId="Title">
     <w:name w:val="Title"/>

</xml_diff>

<commit_message>
Pagos ME: los Fundadores traen SOLO con el boton (sin horario automatico, el programa nunca abre Chrome por su cuenta); el horario queda solo para la empresa duena. Guias PDF al dia
Co-Authored-By: Claude Opus 5.5 <noreply@anthropic.com>
</commit_message>
<xml_diff>
--- a/tools/vigilante-pagos-me/guia/Guia-Dueno-Activar-Pagos-ME.docx
+++ b/tools/vigilante-pagos-me/guia/Guia-Dueno-Activar-Pagos-ME.docx
@@ -182,17 +182,17 @@
         <w:t xml:space="preserve">☐  </w:t>
       </w:r>
       <w:r>
-        <w:t xml:space="preserve">El horario automático ya viene puesto: </w:t>
+        <w:t xml:space="preserve">No hay horario automático: </w:t>
       </w:r>
       <w:r>
         <w:rPr>
           <w:b/>
           <w:bCs/>
         </w:rPr>
-        <w:t xml:space="preserve">lunes a sábado, 8:00, 12:00, 4:00 y 7:00 p. m.</w:t>
-      </w:r>
-      <w:r>
-        <w:t xml:space="preserve"> Si quiere otro, se cambia con él en la llamada.</w:t>
+        <w:t xml:space="preserve">se trae solo cuando él toca «Traer pagos y guías»</w:t>
+      </w:r>
+      <w:r>
+        <w:t xml:space="preserve">. Díselo, así sabe que el programa nunca abre Chrome por su cuenta.</w:t>
       </w:r>
     </w:p>
     <w:p>
@@ -229,7 +229,7 @@
           <w:i/>
           <w:iCs/>
         </w:rPr>
-        <w:t xml:space="preserve">«Esto te ahorra entrar al portal de MercadoEnvíos venta por venta. Un programa en tu PC trae solo los pagos, los comprobantes y las guías de todas tus cuentas.»</w:t>
+        <w:t xml:space="preserve">«Esto te ahorra entrar al portal de MercadoEnvíos venta por venta. Un programa en tu PC trae, con un botón, los pagos, los comprobantes y las guías de todas tus cuentas. Solo trabaja cuando tú lo pides.»</w:t>
       </w:r>
     </w:p>
     <w:p>
@@ -293,7 +293,7 @@
         <w:t xml:space="preserve">PC con Windows donde imprime las guías</w:t>
       </w:r>
       <w:r>
-        <w:t xml:space="preserve">, prendida en los horarios en que quiere traer.</w:t>
+        <w:t xml:space="preserve">.</w:t>
       </w:r>
     </w:p>
     <w:p>
@@ -1182,10 +1182,10 @@
                 <w:b/>
                 <w:bCs/>
               </w:rPr>
-              <w:t xml:space="preserve">3. La PC prendida en los horarios.</w:t>
-            </w:r>
-            <w:r>
-              <w:t xml:space="preserve"> Si estaba apagada no pasa nada: al prenderla trae lo que faltaba.</w:t>
+              <w:t xml:space="preserve">3. Traer cuando lo necesite.</w:t>
+            </w:r>
+            <w:r>
+              <w:t xml:space="preserve"> Toca «Traer pagos y guías»: el programa solo trabaja cuando él lo pide.</w:t>
             </w:r>
           </w:p>
         </w:tc>
@@ -2062,139 +2062,6 @@
     <w:basedOn w:val="Normal"/>
     <w:qFormat/>
   </w:style>
-  <w:style w:type="paragraph" w:styleId="Caption">
-    <w:name w:val="caption"/>
-    <w:basedOn w:val="Normal"/>
-    <w:next w:val="Normal"/>
-    <w:uiPriority w:val="35"/>
-    <w:semiHidden/>
-    <w:unhideWhenUsed/>
-    <w:qFormat/>
-    <w:pPr>
-      <w:spacing w:after="200"/>
-    </w:pPr>
-    <w:rPr>
-      <w:i/>
-      <w:iCs/>
-      <w:color w:val="44546A" w:themeColor="dark2"/>
-      <w:sz w:val="18"/>
-      <w:szCs w:val="18"/>
-    </w:rPr>
-  </w:style>
-  <w:style w:type="paragraph" w:styleId="Bibliography">
-    <w:name w:val="Bibliography"/>
-    <w:basedOn w:val="Normal"/>
-    <w:next w:val="Normal"/>
-    <w:uiPriority w:val="37"/>
-    <w:unhideWhenUsed/>
-  </w:style>
-  <w:style w:type="paragraph" w:styleId="TOC1">
-    <w:name w:val="toc 1"/>
-    <w:basedOn w:val="Normal"/>
-    <w:next w:val="Normal"/>
-    <w:uiPriority w:val="39"/>
-    <w:semiHidden/>
-    <w:unhideWhenUsed/>
-    <w:pPr>
-      <w:spacing w:after="100"/>
-    </w:pPr>
-  </w:style>
-  <w:style w:type="paragraph" w:styleId="TOC2">
-    <w:name w:val="toc 2"/>
-    <w:basedOn w:val="Normal"/>
-    <w:next w:val="Normal"/>
-    <w:uiPriority w:val="39"/>
-    <w:semiHidden/>
-    <w:unhideWhenUsed/>
-    <w:pPr>
-      <w:spacing w:after="100"/>
-      <w:ind w:left="220"/>
-    </w:pPr>
-  </w:style>
-  <w:style w:type="paragraph" w:styleId="TOC3">
-    <w:name w:val="toc 3"/>
-    <w:basedOn w:val="Normal"/>
-    <w:next w:val="Normal"/>
-    <w:uiPriority w:val="39"/>
-    <w:semiHidden/>
-    <w:unhideWhenUsed/>
-    <w:pPr>
-      <w:spacing w:after="100"/>
-      <w:ind w:left="440"/>
-    </w:pPr>
-  </w:style>
-  <w:style w:type="paragraph" w:styleId="TOC4">
-    <w:name w:val="toc 4"/>
-    <w:basedOn w:val="Normal"/>
-    <w:next w:val="Normal"/>
-    <w:uiPriority w:val="39"/>
-    <w:semiHidden/>
-    <w:unhideWhenUsed/>
-    <w:pPr>
-      <w:spacing w:after="100"/>
-      <w:ind w:left="660"/>
-    </w:pPr>
-  </w:style>
-  <w:style w:type="paragraph" w:styleId="TOC5">
-    <w:name w:val="toc 5"/>
-    <w:basedOn w:val="Normal"/>
-    <w:next w:val="Normal"/>
-    <w:uiPriority w:val="39"/>
-    <w:semiHidden/>
-    <w:unhideWhenUsed/>
-    <w:pPr>
-      <w:spacing w:after="100"/>
-      <w:ind w:left="880"/>
-    </w:pPr>
-  </w:style>
-  <w:style w:type="paragraph" w:styleId="TOC6">
-    <w:name w:val="toc 6"/>
-    <w:basedOn w:val="Normal"/>
-    <w:next w:val="Normal"/>
-    <w:uiPriority w:val="39"/>
-    <w:semiHidden/>
-    <w:unhideWhenUsed/>
-    <w:pPr>
-      <w:spacing w:after="100"/>
-      <w:ind w:left="1100"/>
-    </w:pPr>
-  </w:style>
-  <w:style w:type="paragraph" w:styleId="TOC7">
-    <w:name w:val="toc 7"/>
-    <w:basedOn w:val="Normal"/>
-    <w:next w:val="Normal"/>
-    <w:uiPriority w:val="39"/>
-    <w:semiHidden/>
-    <w:unhideWhenUsed/>
-    <w:pPr>
-      <w:spacing w:after="100"/>
-      <w:ind w:left="1320"/>
-    </w:pPr>
-  </w:style>
-  <w:style w:type="paragraph" w:styleId="TOC8">
-    <w:name w:val="toc 8"/>
-    <w:basedOn w:val="Normal"/>
-    <w:next w:val="Normal"/>
-    <w:uiPriority w:val="39"/>
-    <w:semiHidden/>
-    <w:unhideWhenUsed/>
-    <w:pPr>
-      <w:spacing w:after="100"/>
-      <w:ind w:left="1540"/>
-    </w:pPr>
-  </w:style>
-  <w:style w:type="paragraph" w:styleId="TOC9">
-    <w:name w:val="toc 9"/>
-    <w:basedOn w:val="Normal"/>
-    <w:next w:val="Normal"/>
-    <w:uiPriority w:val="39"/>
-    <w:semiHidden/>
-    <w:unhideWhenUsed/>
-    <w:pPr>
-      <w:spacing w:after="100"/>
-      <w:ind w:left="1760"/>
-    </w:pPr>
-  </w:style>
   <w:style w:type="character" w:styleId="Hyperlink">
     <w:name w:val="Hyperlink"/>
     <w:basedOn w:val="DefaultParagraphFont"/>
@@ -2278,13 +2145,6 @@
       <w:sz w:val="20"/>
       <w:szCs w:val="20"/>
     </w:rPr>
-  </w:style>
-  <w:style w:type="character" w:styleId="LineNumber">
-    <w:name w:val="line number"/>
-    <w:basedOn w:val="DefaultParagraphFont"/>
-    <w:uiPriority w:val="99"/>
-    <w:semiHidden/>
-    <w:unhideWhenUsed/>
   </w:style>
   <w:style w:type="paragraph" w:styleId="Title">
     <w:name w:val="Title"/>

</xml_diff>